<commit_message>
Move database dump to project root
</commit_message>
<xml_diff>
--- a/dokumentacija.docx
+++ b/dokumentacija.docx
@@ -203,6 +203,46 @@
           <w:szCs w:val="32"/>
         </w:rPr>
       </w:pPr>
+      <w:r>
+        <w:rPr>
+          <w:sz w:val="32"/>
+          <w:szCs w:val="32"/>
+        </w:rPr>
+        <w:t xml:space="preserve">Admin </w:t>
+      </w:r>
+      <w:proofErr w:type="spellStart"/>
+      <w:r>
+        <w:rPr>
+          <w:sz w:val="32"/>
+          <w:szCs w:val="32"/>
+        </w:rPr>
+        <w:t>nalog</w:t>
+      </w:r>
+      <w:proofErr w:type="spellEnd"/>
+      <w:r>
+        <w:rPr>
+          <w:sz w:val="32"/>
+          <w:szCs w:val="32"/>
+        </w:rPr>
+        <w:t xml:space="preserve">: </w:t>
+      </w:r>
+      <w:hyperlink r:id="rId6" w:history="1">
+        <w:r>
+          <w:rPr>
+            <w:rStyle w:val="Hiperveza"/>
+            <w:sz w:val="32"/>
+            <w:szCs w:val="32"/>
+          </w:rPr>
+          <w:t>admin@gmail.com</w:t>
+        </w:r>
+      </w:hyperlink>
+      <w:r>
+        <w:rPr>
+          <w:sz w:val="32"/>
+          <w:szCs w:val="32"/>
+        </w:rPr>
+        <w:t xml:space="preserve"> admin123</w:t>
+      </w:r>
     </w:p>
     <w:p>
       <w:pPr>
@@ -212,6 +252,46 @@
           <w:szCs w:val="32"/>
         </w:rPr>
       </w:pPr>
+      <w:r>
+        <w:rPr>
+          <w:sz w:val="32"/>
+          <w:szCs w:val="32"/>
+        </w:rPr>
+        <w:t xml:space="preserve">User </w:t>
+      </w:r>
+      <w:proofErr w:type="spellStart"/>
+      <w:r>
+        <w:rPr>
+          <w:sz w:val="32"/>
+          <w:szCs w:val="32"/>
+        </w:rPr>
+        <w:t>nalog</w:t>
+      </w:r>
+      <w:proofErr w:type="spellEnd"/>
+      <w:r>
+        <w:rPr>
+          <w:sz w:val="32"/>
+          <w:szCs w:val="32"/>
+        </w:rPr>
+        <w:t xml:space="preserve">: </w:t>
+      </w:r>
+      <w:hyperlink r:id="rId7" w:history="1">
+        <w:r>
+          <w:rPr>
+            <w:rStyle w:val="Hiperveza"/>
+            <w:sz w:val="32"/>
+            <w:szCs w:val="32"/>
+          </w:rPr>
+          <w:t>user123@gmail.com</w:t>
+        </w:r>
+      </w:hyperlink>
+      <w:r>
+        <w:rPr>
+          <w:sz w:val="32"/>
+          <w:szCs w:val="32"/>
+        </w:rPr>
+        <w:t xml:space="preserve"> user123</w:t>
+      </w:r>
     </w:p>
     <w:p>
       <w:pPr>
@@ -235,6 +315,15 @@
       <w:pPr>
         <w:jc w:val="center"/>
         <w:rPr>
+          <w:sz w:val="32"/>
+          <w:szCs w:val="32"/>
+        </w:rPr>
+      </w:pPr>
+    </w:p>
+    <w:p>
+      <w:pPr>
+        <w:jc w:val="center"/>
+        <w:rPr>
           <w:sz w:val="48"/>
           <w:szCs w:val="48"/>
         </w:rPr>
@@ -264,6 +353,14 @@
     </w:p>
     <w:sdt>
       <w:sdtPr>
+        <w:rPr>
+          <w:rFonts w:asciiTheme="minorHAnsi" w:eastAsiaTheme="minorHAnsi" w:hAnsiTheme="minorHAnsi" w:cstheme="minorBidi"/>
+          <w:color w:val="auto"/>
+          <w:kern w:val="2"/>
+          <w:sz w:val="24"/>
+          <w:szCs w:val="24"/>
+          <w14:ligatures w14:val="standardContextual"/>
+        </w:rPr>
         <w:id w:val="-2096701246"/>
         <w:docPartObj>
           <w:docPartGallery w:val="Table of Contents"/>
@@ -272,15 +369,9 @@
       </w:sdtPr>
       <w:sdtEndPr>
         <w:rPr>
-          <w:rFonts w:asciiTheme="minorHAnsi" w:eastAsiaTheme="minorHAnsi" w:hAnsiTheme="minorHAnsi" w:cstheme="minorBidi"/>
           <w:b/>
           <w:bCs/>
           <w:noProof/>
-          <w:color w:val="auto"/>
-          <w:kern w:val="2"/>
-          <w:sz w:val="24"/>
-          <w:szCs w:val="24"/>
-          <w14:ligatures w14:val="standardContextual"/>
         </w:rPr>
       </w:sdtEndPr>
       <w:sdtContent>
@@ -293,10 +384,7 @@
             <w:t>Sadr</w:t>
           </w:r>
           <w:r>
-            <w:t>ž</w:t>
-          </w:r>
-          <w:r>
-            <w:t>aj</w:t>
+            <w:t>žaj</w:t>
           </w:r>
           <w:proofErr w:type="spellEnd"/>
         </w:p>
@@ -9459,6 +9547,9 @@
         <w:br/>
       </w:r>
       <w:r>
+        <w:rPr>
+          <w:noProof/>
+        </w:rPr>
         <w:drawing>
           <wp:inline distT="0" distB="0" distL="0" distR="0" wp14:anchorId="1DA584BF" wp14:editId="2ABCF3BB">
             <wp:extent cx="2579977" cy="5619750"/>
@@ -9475,7 +9566,7 @@
                     <pic:cNvPicPr/>
                   </pic:nvPicPr>
                   <pic:blipFill>
-                    <a:blip r:embed="rId6"/>
+                    <a:blip r:embed="rId8"/>
                     <a:stretch>
                       <a:fillRect/>
                     </a:stretch>
@@ -9499,6 +9590,9 @@
         <w:t>v</w:t>
       </w:r>
       <w:r>
+        <w:rPr>
+          <w:noProof/>
+        </w:rPr>
         <w:drawing>
           <wp:inline distT="0" distB="0" distL="0" distR="0" wp14:anchorId="6DD43E71" wp14:editId="026C66A5">
             <wp:extent cx="2667372" cy="5639587"/>
@@ -9515,7 +9609,7 @@
                     <pic:cNvPicPr/>
                   </pic:nvPicPr>
                   <pic:blipFill>
-                    <a:blip r:embed="rId7"/>
+                    <a:blip r:embed="rId9"/>
                     <a:stretch>
                       <a:fillRect/>
                     </a:stretch>
@@ -9568,6 +9662,9 @@
     </w:p>
     <w:p>
       <w:r>
+        <w:rPr>
+          <w:noProof/>
+        </w:rPr>
         <w:drawing>
           <wp:inline distT="0" distB="0" distL="0" distR="0" wp14:anchorId="54895A18" wp14:editId="5BD7C4F4">
             <wp:extent cx="6525276" cy="4181475"/>
@@ -9584,7 +9681,7 @@
                     <pic:cNvPicPr/>
                   </pic:nvPicPr>
                   <pic:blipFill>
-                    <a:blip r:embed="rId8"/>
+                    <a:blip r:embed="rId10"/>
                     <a:stretch>
                       <a:fillRect/>
                     </a:stretch>
@@ -9645,6 +9742,9 @@
     </w:p>
     <w:p>
       <w:r>
+        <w:rPr>
+          <w:noProof/>
+        </w:rPr>
         <w:drawing>
           <wp:inline distT="0" distB="0" distL="0" distR="0" wp14:anchorId="2798E47E" wp14:editId="5BED45E0">
             <wp:extent cx="5943600" cy="3046730"/>
@@ -9661,7 +9761,7 @@
                     <pic:cNvPicPr/>
                   </pic:nvPicPr>
                   <pic:blipFill>
-                    <a:blip r:embed="rId9"/>
+                    <a:blip r:embed="rId11"/>
                     <a:stretch>
                       <a:fillRect/>
                     </a:stretch>
@@ -10169,6 +10269,9 @@
     </w:p>
     <w:p>
       <w:r>
+        <w:rPr>
+          <w:noProof/>
+        </w:rPr>
         <w:drawing>
           <wp:inline distT="0" distB="0" distL="0" distR="0" wp14:anchorId="02842661" wp14:editId="7D6F93F9">
             <wp:extent cx="6000750" cy="4461455"/>
@@ -10185,7 +10288,7 @@
                     <pic:cNvPicPr/>
                   </pic:nvPicPr>
                   <pic:blipFill>
-                    <a:blip r:embed="rId10"/>
+                    <a:blip r:embed="rId12"/>
                     <a:stretch>
                       <a:fillRect/>
                     </a:stretch>
@@ -10599,6 +10702,9 @@
     </w:p>
     <w:p>
       <w:r>
+        <w:rPr>
+          <w:noProof/>
+        </w:rPr>
         <w:drawing>
           <wp:inline distT="0" distB="0" distL="0" distR="0" wp14:anchorId="5BB0F344" wp14:editId="21282BD2">
             <wp:extent cx="5943600" cy="3583940"/>
@@ -10615,7 +10721,7 @@
                     <pic:cNvPicPr/>
                   </pic:nvPicPr>
                   <pic:blipFill>
-                    <a:blip r:embed="rId11"/>
+                    <a:blip r:embed="rId13"/>
                     <a:stretch>
                       <a:fillRect/>
                     </a:stretch>
@@ -11060,6 +11166,9 @@
     </w:p>
     <w:p>
       <w:r>
+        <w:rPr>
+          <w:noProof/>
+        </w:rPr>
         <w:drawing>
           <wp:inline distT="0" distB="0" distL="0" distR="0" wp14:anchorId="59A0A0FF" wp14:editId="13273C92">
             <wp:extent cx="5943600" cy="1697990"/>
@@ -11076,7 +11185,7 @@
                     <pic:cNvPicPr/>
                   </pic:nvPicPr>
                   <pic:blipFill>
-                    <a:blip r:embed="rId12"/>
+                    <a:blip r:embed="rId14"/>
                     <a:stretch>
                       <a:fillRect/>
                     </a:stretch>
@@ -11386,6 +11495,9 @@
     </w:p>
     <w:p>
       <w:r>
+        <w:rPr>
+          <w:noProof/>
+        </w:rPr>
         <w:drawing>
           <wp:inline distT="0" distB="0" distL="0" distR="0" wp14:anchorId="000EBC11" wp14:editId="54B3998B">
             <wp:extent cx="5943600" cy="3350895"/>
@@ -11402,7 +11514,7 @@
                     <pic:cNvPicPr/>
                   </pic:nvPicPr>
                   <pic:blipFill>
-                    <a:blip r:embed="rId13"/>
+                    <a:blip r:embed="rId15"/>
                     <a:stretch>
                       <a:fillRect/>
                     </a:stretch>
@@ -11767,6 +11879,9 @@
     </w:p>
     <w:p>
       <w:r>
+        <w:rPr>
+          <w:noProof/>
+        </w:rPr>
         <w:drawing>
           <wp:inline distT="0" distB="0" distL="0" distR="0" wp14:anchorId="6637E9EC" wp14:editId="0EA9B1D3">
             <wp:extent cx="5943600" cy="1664335"/>
@@ -11783,7 +11898,7 @@
                     <pic:cNvPicPr/>
                   </pic:nvPicPr>
                   <pic:blipFill>
-                    <a:blip r:embed="rId14"/>
+                    <a:blip r:embed="rId16"/>
                     <a:stretch>
                       <a:fillRect/>
                     </a:stretch>
@@ -12109,6 +12224,9 @@
         <w:jc w:val="center"/>
       </w:pPr>
       <w:r>
+        <w:rPr>
+          <w:noProof/>
+        </w:rPr>
         <w:drawing>
           <wp:inline distT="0" distB="0" distL="0" distR="0" wp14:anchorId="498C5480" wp14:editId="5BA3A29A">
             <wp:extent cx="4008489" cy="4105275"/>
@@ -12125,7 +12243,7 @@
                     <pic:cNvPicPr/>
                   </pic:nvPicPr>
                   <pic:blipFill>
-                    <a:blip r:embed="rId15"/>
+                    <a:blip r:embed="rId17"/>
                     <a:stretch>
                       <a:fillRect/>
                     </a:stretch>
@@ -12537,6 +12655,9 @@
         <w:jc w:val="center"/>
       </w:pPr>
       <w:r>
+        <w:rPr>
+          <w:noProof/>
+        </w:rPr>
         <w:drawing>
           <wp:inline distT="0" distB="0" distL="0" distR="0" wp14:anchorId="25465AE4" wp14:editId="103EF497">
             <wp:extent cx="4957655" cy="2876550"/>
@@ -12553,7 +12674,7 @@
                     <pic:cNvPicPr/>
                   </pic:nvPicPr>
                   <pic:blipFill>
-                    <a:blip r:embed="rId16"/>
+                    <a:blip r:embed="rId18"/>
                     <a:stretch>
                       <a:fillRect/>
                     </a:stretch>
@@ -12934,6 +13055,9 @@
     </w:p>
     <w:p>
       <w:r>
+        <w:rPr>
+          <w:noProof/>
+        </w:rPr>
         <w:drawing>
           <wp:inline distT="0" distB="0" distL="0" distR="0" wp14:anchorId="4A80AE0E" wp14:editId="3DE98177">
             <wp:extent cx="5943600" cy="2310765"/>
@@ -12950,7 +13074,7 @@
                     <pic:cNvPicPr/>
                   </pic:nvPicPr>
                   <pic:blipFill>
-                    <a:blip r:embed="rId17"/>
+                    <a:blip r:embed="rId19"/>
                     <a:stretch>
                       <a:fillRect/>
                     </a:stretch>
@@ -13279,6 +13403,9 @@
         <w:jc w:val="center"/>
       </w:pPr>
       <w:r>
+        <w:rPr>
+          <w:noProof/>
+        </w:rPr>
         <w:drawing>
           <wp:inline distT="0" distB="0" distL="0" distR="0" wp14:anchorId="606CE6C1" wp14:editId="13A0ADA2">
             <wp:extent cx="5400675" cy="4931001"/>
@@ -13295,7 +13422,7 @@
                     <pic:cNvPicPr/>
                   </pic:nvPicPr>
                   <pic:blipFill>
-                    <a:blip r:embed="rId18"/>
+                    <a:blip r:embed="rId20"/>
                     <a:stretch>
                       <a:fillRect/>
                     </a:stretch>
@@ -13773,6 +13900,9 @@
     </w:p>
     <w:p>
       <w:r>
+        <w:rPr>
+          <w:noProof/>
+        </w:rPr>
         <w:drawing>
           <wp:inline distT="0" distB="0" distL="0" distR="0" wp14:anchorId="0802DBD1" wp14:editId="78F158EA">
             <wp:extent cx="5943600" cy="5197475"/>
@@ -13789,7 +13919,7 @@
                     <pic:cNvPicPr/>
                   </pic:nvPicPr>
                   <pic:blipFill>
-                    <a:blip r:embed="rId19"/>
+                    <a:blip r:embed="rId21"/>
                     <a:stretch>
                       <a:fillRect/>
                     </a:stretch>
@@ -14139,6 +14269,9 @@
     </w:p>
     <w:p>
       <w:r>
+        <w:rPr>
+          <w:noProof/>
+        </w:rPr>
         <w:drawing>
           <wp:inline distT="0" distB="0" distL="0" distR="0" wp14:anchorId="052E6781" wp14:editId="7A89981F">
             <wp:extent cx="6400800" cy="2377733"/>
@@ -14155,7 +14288,7 @@
                     <pic:cNvPicPr/>
                   </pic:nvPicPr>
                   <pic:blipFill>
-                    <a:blip r:embed="rId20"/>
+                    <a:blip r:embed="rId22"/>
                     <a:stretch>
                       <a:fillRect/>
                     </a:stretch>
@@ -15039,6 +15172,9 @@
         <w:t>.</w:t>
       </w:r>
       <w:r>
+        <w:rPr>
+          <w:noProof/>
+        </w:rPr>
         <w:drawing>
           <wp:anchor distT="0" distB="0" distL="114300" distR="114300" simplePos="0" relativeHeight="251658240" behindDoc="0" locked="0" layoutInCell="1" allowOverlap="1" wp14:anchorId="0CC4F72A" wp14:editId="219E3937">
             <wp:simplePos x="914400" y="5314950"/>
@@ -15063,7 +15199,7 @@
                     <pic:cNvPicPr/>
                   </pic:nvPicPr>
                   <pic:blipFill>
-                    <a:blip r:embed="rId21">
+                    <a:blip r:embed="rId23">
                       <a:extLst>
                         <a:ext uri="{28A0092B-C50C-407E-A947-70E740481C1C}">
                           <a14:useLocalDpi xmlns:a14="http://schemas.microsoft.com/office/drawing/2010/main" val="0"/>
@@ -15109,6 +15245,9 @@
         <w:jc w:val="center"/>
       </w:pPr>
       <w:r>
+        <w:rPr>
+          <w:noProof/>
+        </w:rPr>
         <w:drawing>
           <wp:inline distT="0" distB="0" distL="0" distR="0" wp14:anchorId="7012A30F" wp14:editId="2CF31618">
             <wp:extent cx="3867150" cy="1473571"/>
@@ -15125,7 +15264,7 @@
                     <pic:cNvPicPr/>
                   </pic:nvPicPr>
                   <pic:blipFill>
-                    <a:blip r:embed="rId22"/>
+                    <a:blip r:embed="rId24"/>
                     <a:stretch>
                       <a:fillRect/>
                     </a:stretch>
@@ -15410,6 +15549,9 @@
     </w:p>
     <w:p>
       <w:r>
+        <w:rPr>
+          <w:noProof/>
+        </w:rPr>
         <w:drawing>
           <wp:inline distT="0" distB="0" distL="0" distR="0" wp14:anchorId="454AFB99" wp14:editId="5D45F021">
             <wp:extent cx="5943600" cy="3361055"/>
@@ -15426,7 +15568,7 @@
                     <pic:cNvPicPr/>
                   </pic:nvPicPr>
                   <pic:blipFill>
-                    <a:blip r:embed="rId23"/>
+                    <a:blip r:embed="rId25"/>
                     <a:stretch>
                       <a:fillRect/>
                     </a:stretch>
@@ -15808,6 +15950,9 @@
     </w:p>
     <w:p>
       <w:r>
+        <w:rPr>
+          <w:noProof/>
+        </w:rPr>
         <w:drawing>
           <wp:inline distT="0" distB="0" distL="0" distR="0" wp14:anchorId="5F8AE2E5" wp14:editId="790B8DD2">
             <wp:extent cx="5943600" cy="2792730"/>
@@ -15824,7 +15969,7 @@
                     <pic:cNvPicPr/>
                   </pic:nvPicPr>
                   <pic:blipFill>
-                    <a:blip r:embed="rId24"/>
+                    <a:blip r:embed="rId26"/>
                     <a:stretch>
                       <a:fillRect/>
                     </a:stretch>
@@ -20896,15 +21041,7 @@
       </w:r>
       <w:proofErr w:type="spellEnd"/>
       <w:r>
-        <w:t xml:space="preserve"> class="product-</w:t>
-      </w:r>
-      <w:proofErr w:type="spellStart"/>
-      <w:r>
-        <w:t>img</w:t>
-      </w:r>
-      <w:proofErr w:type="spellEnd"/>
-      <w:r>
-        <w:t xml:space="preserve">" </w:t>
+        <w:t xml:space="preserve"> class="product-img" </w:t>
       </w:r>
       <w:proofErr w:type="spellStart"/>
       <w:r>
@@ -21102,23 +21239,7 @@
       </w:r>
       <w:proofErr w:type="spellEnd"/>
       <w:r>
-        <w:t xml:space="preserve"> </w:t>
-      </w:r>
-      <w:proofErr w:type="spellStart"/>
-      <w:r>
-        <w:t>btn-sm</w:t>
-      </w:r>
-      <w:proofErr w:type="spellEnd"/>
-      <w:r>
-        <w:t xml:space="preserve"> </w:t>
-      </w:r>
-      <w:proofErr w:type="spellStart"/>
-      <w:r>
-        <w:t>btn</w:t>
-      </w:r>
-      <w:proofErr w:type="spellEnd"/>
-      <w:r>
-        <w:t>-dark"&gt;</w:t>
+        <w:t xml:space="preserve"> btn-sm btn-dark"&gt;</w:t>
       </w:r>
     </w:p>
     <w:p>
@@ -28197,15 +28318,7 @@
       </w:r>
       <w:proofErr w:type="spellEnd"/>
       <w:r>
-        <w:t>=products" class="</w:t>
-      </w:r>
-      <w:proofErr w:type="spellStart"/>
-      <w:r>
-        <w:t>btn</w:t>
-      </w:r>
-      <w:proofErr w:type="spellEnd"/>
-      <w:r>
-        <w:t xml:space="preserve"> </w:t>
+        <w:t xml:space="preserve">=products" class="btn </w:t>
       </w:r>
       <w:proofErr w:type="spellStart"/>
       <w:r>
@@ -28573,15 +28686,7 @@
       </w:r>
       <w:proofErr w:type="spellEnd"/>
       <w:r>
-        <w:t xml:space="preserve"> </w:t>
-      </w:r>
-      <w:proofErr w:type="spellStart"/>
-      <w:r>
-        <w:t>btn-sm</w:t>
-      </w:r>
-      <w:proofErr w:type="spellEnd"/>
-      <w:r>
-        <w:t xml:space="preserve"> </w:t>
+        <w:t xml:space="preserve"> btn-sm </w:t>
       </w:r>
       <w:proofErr w:type="spellStart"/>
       <w:r>
@@ -28669,15 +28774,7 @@
       </w:r>
       <w:proofErr w:type="spellEnd"/>
       <w:r>
-        <w:t xml:space="preserve"> </w:t>
-      </w:r>
-      <w:proofErr w:type="spellStart"/>
-      <w:r>
-        <w:t>btn-sm</w:t>
-      </w:r>
-      <w:proofErr w:type="spellEnd"/>
-      <w:r>
-        <w:t xml:space="preserve"> </w:t>
+        <w:t xml:space="preserve"> btn-sm </w:t>
       </w:r>
       <w:proofErr w:type="spellStart"/>
       <w:r>
@@ -28779,23 +28876,7 @@
       </w:r>
       <w:proofErr w:type="spellEnd"/>
       <w:r>
-        <w:t xml:space="preserve"> </w:t>
-      </w:r>
-      <w:proofErr w:type="spellStart"/>
-      <w:r>
-        <w:t>btn-sm</w:t>
-      </w:r>
-      <w:proofErr w:type="spellEnd"/>
-      <w:r>
-        <w:t xml:space="preserve"> </w:t>
-      </w:r>
-      <w:proofErr w:type="spellStart"/>
-      <w:r>
-        <w:t>btn</w:t>
-      </w:r>
-      <w:proofErr w:type="spellEnd"/>
-      <w:r>
-        <w:t>-danger"&gt;</w:t>
+        <w:t xml:space="preserve"> btn-sm btn-danger"&gt;</w:t>
       </w:r>
     </w:p>
     <w:p>
@@ -29762,23 +29843,7 @@
       </w:r>
       <w:proofErr w:type="spellEnd"/>
       <w:r>
-        <w:t xml:space="preserve"> </w:t>
-      </w:r>
-      <w:proofErr w:type="spellStart"/>
-      <w:r>
-        <w:t>btn-sm</w:t>
-      </w:r>
-      <w:proofErr w:type="spellEnd"/>
-      <w:r>
-        <w:t xml:space="preserve"> </w:t>
-      </w:r>
-      <w:proofErr w:type="spellStart"/>
-      <w:r>
-        <w:t>btn</w:t>
-      </w:r>
-      <w:proofErr w:type="spellEnd"/>
-      <w:r>
-        <w:t>-dark"&gt;</w:t>
+        <w:t xml:space="preserve"> btn-sm btn-dark"&gt;</w:t>
       </w:r>
     </w:p>
     <w:p>
@@ -30111,15 +30176,7 @@
       </w:r>
       <w:proofErr w:type="spellEnd"/>
       <w:r>
-        <w:t xml:space="preserve"> </w:t>
-      </w:r>
-      <w:proofErr w:type="spellStart"/>
-      <w:r>
-        <w:t>kasnije</w:t>
-      </w:r>
-      <w:proofErr w:type="spellEnd"/>
-      <w:r>
-        <w:t>.";</w:t>
+        <w:t xml:space="preserve"> kasnije.";</w:t>
       </w:r>
     </w:p>
     <w:p>
@@ -33218,13 +33275,8 @@
       </w:r>
       <w:proofErr w:type="spellEnd"/>
       <w:r>
-        <w:t xml:space="preserve"> </w:t>
-      </w:r>
-      <w:proofErr w:type="spellStart"/>
-      <w:r>
-        <w:t>endforeach</w:t>
-      </w:r>
-      <w:proofErr w:type="spellEnd"/>
+        <w:t xml:space="preserve"> endforeach</w:t>
+      </w:r>
       <w:proofErr w:type="gramStart"/>
       <w:r>
         <w:t>; ?</w:t>
@@ -33350,13 +33402,8 @@
       </w:r>
       <w:proofErr w:type="spellEnd"/>
       <w:r>
-        <w:t xml:space="preserve"> </w:t>
-      </w:r>
-      <w:proofErr w:type="spellStart"/>
-      <w:r>
-        <w:t>endforeach</w:t>
-      </w:r>
-      <w:proofErr w:type="spellEnd"/>
+        <w:t xml:space="preserve"> endforeach</w:t>
+      </w:r>
       <w:proofErr w:type="gramStart"/>
       <w:r>
         <w:t>; ?</w:t>
@@ -38490,15 +38537,7 @@
       </w:r>
       <w:proofErr w:type="spellEnd"/>
       <w:r>
-        <w:t xml:space="preserve"> id="</w:t>
-      </w:r>
-      <w:proofErr w:type="spellStart"/>
-      <w:r>
-        <w:t>productTable</w:t>
-      </w:r>
-      <w:proofErr w:type="spellEnd"/>
-      <w:r>
-        <w:t>"&gt;</w:t>
+        <w:t xml:space="preserve"> id="productTable"&gt;</w:t>
       </w:r>
     </w:p>
     <w:p>
@@ -38878,15 +38917,27 @@
       </w:r>
       <w:proofErr w:type="spellEnd"/>
       <w:r>
-        <w:t xml:space="preserve"> </w:t>
-      </w:r>
-      <w:proofErr w:type="spellStart"/>
-      <w:r>
-        <w:t>btn-sm</w:t>
-      </w:r>
-      <w:proofErr w:type="spellEnd"/>
-      <w:r>
-        <w:t xml:space="preserve"> </w:t>
+        <w:t xml:space="preserve"> btn-sm btn-outline-warning"&gt;</w:t>
+      </w:r>
+    </w:p>
+    <w:p>
+      <w:r>
+        <w:t>                                        Edit</w:t>
+      </w:r>
+    </w:p>
+    <w:p>
+      <w:r>
+        <w:t>                                    &lt;/a&gt;</w:t>
+      </w:r>
+    </w:p>
+    <w:p>
+      <w:r>
+        <w:t>                                    &lt;button</w:t>
+      </w:r>
+    </w:p>
+    <w:p>
+      <w:r>
+        <w:t>                                        class="</w:t>
       </w:r>
       <w:proofErr w:type="spellStart"/>
       <w:r>
@@ -38894,51 +38945,7 @@
       </w:r>
       <w:proofErr w:type="spellEnd"/>
       <w:r>
-        <w:t>-outline-warning"&gt;</w:t>
-      </w:r>
-    </w:p>
-    <w:p>
-      <w:r>
-        <w:t>                                        Edit</w:t>
-      </w:r>
-    </w:p>
-    <w:p>
-      <w:r>
-        <w:t>                                    &lt;/a&gt;</w:t>
-      </w:r>
-    </w:p>
-    <w:p>
-      <w:r>
-        <w:t>                                    &lt;button</w:t>
-      </w:r>
-    </w:p>
-    <w:p>
-      <w:r>
-        <w:t>                                        class="</w:t>
-      </w:r>
-      <w:proofErr w:type="spellStart"/>
-      <w:r>
-        <w:t>btn</w:t>
-      </w:r>
-      <w:proofErr w:type="spellEnd"/>
-      <w:r>
-        <w:t xml:space="preserve"> </w:t>
-      </w:r>
-      <w:proofErr w:type="spellStart"/>
-      <w:r>
-        <w:t>btn-sm</w:t>
-      </w:r>
-      <w:proofErr w:type="spellEnd"/>
-      <w:r>
-        <w:t xml:space="preserve"> </w:t>
-      </w:r>
-      <w:proofErr w:type="spellStart"/>
-      <w:r>
-        <w:t>btn</w:t>
-      </w:r>
-      <w:proofErr w:type="spellEnd"/>
-      <w:r>
-        <w:t>-outline-danger"</w:t>
+        <w:t xml:space="preserve"> btn-sm btn-outline-danger"</w:t>
       </w:r>
     </w:p>
     <w:p>
@@ -39015,13 +39022,8 @@
       </w:r>
       <w:proofErr w:type="spellEnd"/>
       <w:r>
-        <w:t xml:space="preserve"> </w:t>
-      </w:r>
-      <w:proofErr w:type="spellStart"/>
-      <w:r>
-        <w:t>endforeach</w:t>
-      </w:r>
-      <w:proofErr w:type="spellEnd"/>
+        <w:t xml:space="preserve"> endforeach</w:t>
+      </w:r>
       <w:proofErr w:type="gramStart"/>
       <w:r>
         <w:t>; ?</w:t>
@@ -41408,15 +41410,72 @@
       </w:r>
       <w:proofErr w:type="spellEnd"/>
       <w:r>
-        <w:t xml:space="preserve"> </w:t>
-      </w:r>
-      <w:proofErr w:type="spellStart"/>
-      <w:r>
-        <w:t>btn-sm</w:t>
-      </w:r>
-      <w:proofErr w:type="spellEnd"/>
-      <w:r>
-        <w:t xml:space="preserve"> </w:t>
+        <w:t xml:space="preserve"> btn-sm btn-dark"&gt;</w:t>
+      </w:r>
+    </w:p>
+    <w:p>
+      <w:r>
+        <w:t>                                    Update</w:t>
+      </w:r>
+    </w:p>
+    <w:p>
+      <w:r>
+        <w:t>                                &lt;/button&gt;</w:t>
+      </w:r>
+    </w:p>
+    <w:p>
+      <w:r>
+        <w:t>                            &lt;/form&gt;</w:t>
+      </w:r>
+    </w:p>
+    <w:p>
+      <w:r>
+        <w:t xml:space="preserve">                            &lt;a </w:t>
+      </w:r>
+      <w:proofErr w:type="spellStart"/>
+      <w:r>
+        <w:t>href</w:t>
+      </w:r>
+      <w:proofErr w:type="spellEnd"/>
+      <w:r>
+        <w:t>="</w:t>
+      </w:r>
+      <w:proofErr w:type="spellStart"/>
+      <w:r>
+        <w:t>index.php?strana</w:t>
+      </w:r>
+      <w:proofErr w:type="spellEnd"/>
+      <w:r>
+        <w:t>=</w:t>
+      </w:r>
+      <w:proofErr w:type="spellStart"/>
+      <w:r>
+        <w:t>admin_users&amp;user_id</w:t>
+      </w:r>
+      <w:proofErr w:type="spellEnd"/>
+      <w:r>
+        <w:t>=</w:t>
+      </w:r>
+      <w:proofErr w:type="gramStart"/>
+      <w:r>
+        <w:t>&lt;?=</w:t>
+      </w:r>
+      <w:proofErr w:type="gramEnd"/>
+      <w:r>
+        <w:t xml:space="preserve"> $user-&gt;</w:t>
+      </w:r>
+      <w:proofErr w:type="gramStart"/>
+      <w:r>
+        <w:t>id ?</w:t>
+      </w:r>
+      <w:proofErr w:type="gramEnd"/>
+      <w:r>
+        <w:t>&gt;"</w:t>
+      </w:r>
+    </w:p>
+    <w:p>
+      <w:r>
+        <w:t>                               class="</w:t>
       </w:r>
       <w:proofErr w:type="spellStart"/>
       <w:r>
@@ -41424,72 +41483,7 @@
       </w:r>
       <w:proofErr w:type="spellEnd"/>
       <w:r>
-        <w:t>-dark"&gt;</w:t>
-      </w:r>
-    </w:p>
-    <w:p>
-      <w:r>
-        <w:t>                                    Update</w:t>
-      </w:r>
-    </w:p>
-    <w:p>
-      <w:r>
-        <w:t>                                &lt;/button&gt;</w:t>
-      </w:r>
-    </w:p>
-    <w:p>
-      <w:r>
-        <w:t>                            &lt;/form&gt;</w:t>
-      </w:r>
-    </w:p>
-    <w:p>
-      <w:r>
-        <w:t xml:space="preserve">                            &lt;a </w:t>
-      </w:r>
-      <w:proofErr w:type="spellStart"/>
-      <w:r>
-        <w:t>href</w:t>
-      </w:r>
-      <w:proofErr w:type="spellEnd"/>
-      <w:r>
-        <w:t>="</w:t>
-      </w:r>
-      <w:proofErr w:type="spellStart"/>
-      <w:r>
-        <w:t>index.php?strana</w:t>
-      </w:r>
-      <w:proofErr w:type="spellEnd"/>
-      <w:r>
-        <w:t>=</w:t>
-      </w:r>
-      <w:proofErr w:type="spellStart"/>
-      <w:r>
-        <w:t>admin_users&amp;user_id</w:t>
-      </w:r>
-      <w:proofErr w:type="spellEnd"/>
-      <w:r>
-        <w:t>=</w:t>
-      </w:r>
-      <w:proofErr w:type="gramStart"/>
-      <w:r>
-        <w:t>&lt;?=</w:t>
-      </w:r>
-      <w:proofErr w:type="gramEnd"/>
-      <w:r>
-        <w:t xml:space="preserve"> $user-&gt;</w:t>
-      </w:r>
-      <w:proofErr w:type="gramStart"/>
-      <w:r>
-        <w:t>id ?</w:t>
-      </w:r>
-      <w:proofErr w:type="gramEnd"/>
-      <w:r>
-        <w:t>&gt;"</w:t>
-      </w:r>
-    </w:p>
-    <w:p>
-      <w:r>
-        <w:t>                               class="</w:t>
+        <w:t xml:space="preserve"> btn-sm </w:t>
       </w:r>
       <w:proofErr w:type="spellStart"/>
       <w:r>
@@ -41497,22 +41491,6 @@
       </w:r>
       <w:proofErr w:type="spellEnd"/>
       <w:r>
-        <w:t xml:space="preserve"> </w:t>
-      </w:r>
-      <w:proofErr w:type="spellStart"/>
-      <w:r>
-        <w:t>btn-sm</w:t>
-      </w:r>
-      <w:proofErr w:type="spellEnd"/>
-      <w:r>
-        <w:t xml:space="preserve"> </w:t>
-      </w:r>
-      <w:proofErr w:type="spellStart"/>
-      <w:r>
-        <w:t>btn</w:t>
-      </w:r>
-      <w:proofErr w:type="spellEnd"/>
-      <w:r>
         <w:t>-outline-secondary w-100"&gt;</w:t>
       </w:r>
     </w:p>
@@ -41541,13 +41519,8 @@
       </w:r>
       <w:proofErr w:type="spellEnd"/>
       <w:r>
-        <w:t xml:space="preserve"> </w:t>
-      </w:r>
-      <w:proofErr w:type="spellStart"/>
-      <w:r>
-        <w:t>endforeach</w:t>
-      </w:r>
-      <w:proofErr w:type="spellEnd"/>
+        <w:t xml:space="preserve"> endforeach</w:t>
+      </w:r>
       <w:proofErr w:type="gramStart"/>
       <w:r>
         <w:t>; ?</w:t>
@@ -41684,15 +41657,7 @@
       </w:r>
       <w:proofErr w:type="spellEnd"/>
       <w:r>
-        <w:t xml:space="preserve"> if (empty($</w:t>
-      </w:r>
-      <w:proofErr w:type="spellStart"/>
-      <w:r>
-        <w:t>userOrders</w:t>
-      </w:r>
-      <w:proofErr w:type="spellEnd"/>
-      <w:r>
-        <w:t>))</w:t>
+        <w:t xml:space="preserve"> if (empty($userOrders))</w:t>
       </w:r>
       <w:proofErr w:type="gramStart"/>
       <w:r>
@@ -41994,14 +41959,9 @@
       <w:r>
         <w:t xml:space="preserve"> $</w:t>
       </w:r>
-      <w:proofErr w:type="spellStart"/>
-      <w:proofErr w:type="gramStart"/>
-      <w:r>
-        <w:t>uid</w:t>
-      </w:r>
-      <w:proofErr w:type="spellEnd"/>
-      <w:r>
-        <w:t xml:space="preserve"> ?</w:t>
+      <w:proofErr w:type="gramStart"/>
+      <w:r>
+        <w:t>uid ?</w:t>
       </w:r>
       <w:proofErr w:type="gramEnd"/>
       <w:r>
@@ -42018,15 +41978,91 @@
       </w:r>
       <w:proofErr w:type="spellEnd"/>
       <w:r>
-        <w:t xml:space="preserve"> </w:t>
-      </w:r>
-      <w:proofErr w:type="spellStart"/>
-      <w:r>
-        <w:t>btn-sm</w:t>
-      </w:r>
-      <w:proofErr w:type="spellEnd"/>
-      <w:r>
-        <w:t xml:space="preserve"> </w:t>
+        <w:t xml:space="preserve"> btn-sm btn-success"&gt;</w:t>
+      </w:r>
+    </w:p>
+    <w:p>
+      <w:r>
+        <w:t>                                                    Approve</w:t>
+      </w:r>
+    </w:p>
+    <w:p>
+      <w:r>
+        <w:t>                                                &lt;/a&gt;</w:t>
+      </w:r>
+    </w:p>
+    <w:p>
+      <w:r>
+        <w:t xml:space="preserve">                                                &lt;a </w:t>
+      </w:r>
+      <w:proofErr w:type="spellStart"/>
+      <w:r>
+        <w:t>href</w:t>
+      </w:r>
+      <w:proofErr w:type="spellEnd"/>
+      <w:r>
+        <w:t>="</w:t>
+      </w:r>
+      <w:proofErr w:type="spellStart"/>
+      <w:r>
+        <w:t>index.php?strana</w:t>
+      </w:r>
+      <w:proofErr w:type="spellEnd"/>
+      <w:r>
+        <w:t>=</w:t>
+      </w:r>
+      <w:proofErr w:type="spellStart"/>
+      <w:r>
+        <w:t>admin_order_cancel&amp;id</w:t>
+      </w:r>
+      <w:proofErr w:type="spellEnd"/>
+      <w:r>
+        <w:t>=</w:t>
+      </w:r>
+      <w:proofErr w:type="gramStart"/>
+      <w:r>
+        <w:t>&lt;?=</w:t>
+      </w:r>
+      <w:proofErr w:type="gramEnd"/>
+      <w:r>
+        <w:t xml:space="preserve"> $order-&gt;</w:t>
+      </w:r>
+      <w:proofErr w:type="gramStart"/>
+      <w:r>
+        <w:t>id ?</w:t>
+      </w:r>
+      <w:proofErr w:type="gramEnd"/>
+      <w:r>
+        <w:t>&gt;&amp;</w:t>
+      </w:r>
+      <w:proofErr w:type="spellStart"/>
+      <w:r>
+        <w:t>user_id</w:t>
+      </w:r>
+      <w:proofErr w:type="spellEnd"/>
+      <w:r>
+        <w:t>=</w:t>
+      </w:r>
+      <w:proofErr w:type="gramStart"/>
+      <w:r>
+        <w:t>&lt;?=</w:t>
+      </w:r>
+      <w:proofErr w:type="gramEnd"/>
+      <w:r>
+        <w:t xml:space="preserve"> $</w:t>
+      </w:r>
+      <w:proofErr w:type="gramStart"/>
+      <w:r>
+        <w:t>uid ?</w:t>
+      </w:r>
+      <w:proofErr w:type="gramEnd"/>
+      <w:r>
+        <w:t>&gt;"</w:t>
+      </w:r>
+    </w:p>
+    <w:p>
+      <w:r>
+        <w:t>                                                   class="</w:t>
       </w:r>
       <w:proofErr w:type="spellStart"/>
       <w:r>
@@ -42034,120 +42070,7 @@
       </w:r>
       <w:proofErr w:type="spellEnd"/>
       <w:r>
-        <w:t>-success"&gt;</w:t>
-      </w:r>
-    </w:p>
-    <w:p>
-      <w:r>
-        <w:t>                                                    Approve</w:t>
-      </w:r>
-    </w:p>
-    <w:p>
-      <w:r>
-        <w:t>                                                &lt;/a&gt;</w:t>
-      </w:r>
-    </w:p>
-    <w:p>
-      <w:r>
-        <w:t xml:space="preserve">                                                &lt;a </w:t>
-      </w:r>
-      <w:proofErr w:type="spellStart"/>
-      <w:r>
-        <w:t>href</w:t>
-      </w:r>
-      <w:proofErr w:type="spellEnd"/>
-      <w:r>
-        <w:t>="</w:t>
-      </w:r>
-      <w:proofErr w:type="spellStart"/>
-      <w:r>
-        <w:t>index.php?strana</w:t>
-      </w:r>
-      <w:proofErr w:type="spellEnd"/>
-      <w:r>
-        <w:t>=</w:t>
-      </w:r>
-      <w:proofErr w:type="spellStart"/>
-      <w:r>
-        <w:t>admin_order_cancel&amp;id</w:t>
-      </w:r>
-      <w:proofErr w:type="spellEnd"/>
-      <w:r>
-        <w:t>=</w:t>
-      </w:r>
-      <w:proofErr w:type="gramStart"/>
-      <w:r>
-        <w:t>&lt;?=</w:t>
-      </w:r>
-      <w:proofErr w:type="gramEnd"/>
-      <w:r>
-        <w:t xml:space="preserve"> $order-&gt;</w:t>
-      </w:r>
-      <w:proofErr w:type="gramStart"/>
-      <w:r>
-        <w:t>id ?</w:t>
-      </w:r>
-      <w:proofErr w:type="gramEnd"/>
-      <w:r>
-        <w:t>&gt;&amp;</w:t>
-      </w:r>
-      <w:proofErr w:type="spellStart"/>
-      <w:r>
-        <w:t>user_id</w:t>
-      </w:r>
-      <w:proofErr w:type="spellEnd"/>
-      <w:r>
-        <w:t>=</w:t>
-      </w:r>
-      <w:proofErr w:type="gramStart"/>
-      <w:r>
-        <w:t>&lt;?=</w:t>
-      </w:r>
-      <w:proofErr w:type="gramEnd"/>
-      <w:r>
-        <w:t xml:space="preserve"> $</w:t>
-      </w:r>
-      <w:proofErr w:type="spellStart"/>
-      <w:proofErr w:type="gramStart"/>
-      <w:r>
-        <w:t>uid</w:t>
-      </w:r>
-      <w:proofErr w:type="spellEnd"/>
-      <w:r>
-        <w:t xml:space="preserve"> ?</w:t>
-      </w:r>
-      <w:proofErr w:type="gramEnd"/>
-      <w:r>
-        <w:t>&gt;"</w:t>
-      </w:r>
-    </w:p>
-    <w:p>
-      <w:r>
-        <w:t>                                                   class="</w:t>
-      </w:r>
-      <w:proofErr w:type="spellStart"/>
-      <w:r>
-        <w:t>btn</w:t>
-      </w:r>
-      <w:proofErr w:type="spellEnd"/>
-      <w:r>
-        <w:t xml:space="preserve"> </w:t>
-      </w:r>
-      <w:proofErr w:type="spellStart"/>
-      <w:r>
-        <w:t>btn-sm</w:t>
-      </w:r>
-      <w:proofErr w:type="spellEnd"/>
-      <w:r>
-        <w:t xml:space="preserve"> </w:t>
-      </w:r>
-      <w:proofErr w:type="spellStart"/>
-      <w:r>
-        <w:t>btn</w:t>
-      </w:r>
-      <w:proofErr w:type="spellEnd"/>
-      <w:r>
-        <w:t>-danger"&gt;</w:t>
+        <w:t xml:space="preserve"> btn-sm btn-danger"&gt;</w:t>
       </w:r>
     </w:p>
     <w:p>
@@ -42348,13 +42271,8 @@
       </w:r>
       <w:proofErr w:type="spellEnd"/>
       <w:r>
-        <w:t xml:space="preserve"> </w:t>
-      </w:r>
-      <w:proofErr w:type="spellStart"/>
-      <w:r>
-        <w:t>endforeach</w:t>
-      </w:r>
-      <w:proofErr w:type="spellEnd"/>
+        <w:t xml:space="preserve"> endforeach</w:t>
+      </w:r>
       <w:proofErr w:type="gramStart"/>
       <w:r>
         <w:t>; ?</w:t>
@@ -43165,6 +43083,7 @@
   <w:style w:type="character" w:default="1" w:styleId="Podrazumevanifontpasusa">
     <w:name w:val="Default Paragraph Font"/>
     <w:uiPriority w:val="1"/>
+    <w:semiHidden/>
     <w:unhideWhenUsed/>
   </w:style>
   <w:style w:type="table" w:default="1" w:styleId="Normalnatabela">
@@ -43545,6 +43464,18 @@
       <w:u w:val="single"/>
     </w:rPr>
   </w:style>
+  <w:style w:type="character" w:styleId="Nerazreenopominjanje">
+    <w:name w:val="Unresolved Mention"/>
+    <w:basedOn w:val="Podrazumevanifontpasusa"/>
+    <w:uiPriority w:val="99"/>
+    <w:semiHidden/>
+    <w:unhideWhenUsed/>
+    <w:rsid w:val="00195AF5"/>
+    <w:rPr>
+      <w:color w:val="605E5C"/>
+      <w:shd w:val="clear" w:color="auto" w:fill="E1DFDD"/>
+    </w:rPr>
+  </w:style>
 </w:styles>
 </file>
 

</xml_diff>